<commit_message>
Parecer PT1225FL: ponto 2.4 e alínea c) da conclusão (apuramento da apreensão junto da GNR)
Co-Authored-By: Claude Fable 5.1 <noreply@anthropic.com>
Claude-Session: https://claude.ai/code/session_01PZbJKiuBb33px8BvsUFSTo
</commit_message>
<xml_diff>
--- a/Encerramento PT1225FL Cantinho Soberano/Parecer_Encerramento_PT1225FL_final_rev.docx
+++ b/Encerramento PT1225FL Cantinho Soberano/Parecer_Encerramento_PT1225FL_final_rev.docx
@@ -3755,7 +3755,7 @@
           <w:rFonts w:ascii="Aptos Display" w:hAnsi="Aptos Display"/>
           <w:lang w:val="pt-PT"/>
         </w:rPr>
-        <w:t xml:space="preserve">A Informação refere a apreensão de 293 cães sem indicar os depositários nomeados, se permanecem animais no local, e o estado de registo no SIAC. Estes elementos devem ser obtidos e juntos ao processo antes da notificação para audiência prévia, por relevarem para a necessidade da medida e para a sua execução. </w:t>
+        <w:t>A Informação refere a apreensão de 293 cães sem indicar a entidade apreensora, a data, os depositários a quem foram confiados nos termos do n.º 2 do artigo 178.º do Código de Processo Penal, os animais que permaneceram no local e a situação de registo dos animais no SIAC. Estes elementos devem ser obtidos pela DSAVRN junto da GNR, com conhecimento ao Ministério Público, e juntos ao processo antes da notificação para audiência prévia, por relevarem para a necessidade e a execução da medida, para o registo da situação de apreensão no SIAC e para a verificação, pela DGAV, de que os alojamentos dos depositários se encontram registados e em cumprimento do Decreto-Lei n.º 276/2001, de 17 de outubro.</w:t>
       </w:r>
     </w:p>
     <w:p>
@@ -3991,7 +3991,7 @@
           <w:rFonts w:ascii="Aptos Display" w:hAnsi="Aptos Display"/>
           <w:lang w:val="pt-PT"/>
         </w:rPr>
-        <w:t>c) Determinar à DSAVRN que, previamente à notificação, complete o processo com o auto de apreensão dos animais, a identificação dos depositários e do número de animais por depositário, a indicação dos animais que permaneçam no local e a situação de registo no SIAC, e que suprima do texto a notificar o último período da alínea f) da Informação;</w:t>
+        <w:t>c) Determinar à DSAVRN que, previamente à notificação, obtenha junto da GNR, com conhecimento ao Ministério Público, o auto de apreensão dos animais, o despacho de validação e a identificação dos depositários e do número de animais por depositário, apure os animais que permaneçam no local e a situação de registo no SIAC, junte estes elementos ao processo e suprima do texto a notificar o último período da alínea f) da Informação;</w:t>
       </w:r>
     </w:p>
     <w:p>

</xml_diff>